<commit_message>
docs(report): add Foo-Li parameter derivation section 3.5 with crossover table
Write the Foo-Li parameter contribution into the research report draft:
new section 3.5 aligned with the reviewed correction (root-Hermite factor
2 fix; selected-grid wording instead of exhaustive refutation): the
crossover table now shows n=4096 as the only classical >=128-bit candidate
(129.9 classical / 117.9 quantum, honestly noted as below 128 quantum) with
pk 63 GiB / msk 693 GiB / sk 2.9 TiB object sizes, plus the four-orders-of-
magnitude unstructured-vs-ring contrast.  One Sageloli ring v3 real-run
sentence in 3.3, appendix A status updates, evidence entries E13/E14, docx
rebuilt, table-count check bumped to 11; all report checks pass.
</commit_message>
<xml_diff>
--- a/docs/reports/2026-10-19-research-draft/研究报告初稿.docx
+++ b/docs/reports/2026-10-19-research-draft/研究报告初稿.docx
@@ -2115,7 +2115,7 @@
         <w:rPr>
           <w:b w:val="0"/>
         </w:rPr>
-        <w:t>Foo–Li、Yu2026与Sageloli-SIS、Sageloli-RSIS已有完整单体研究后端。其中Sageloli实现覆盖H1/H2、盐、矩阵或环上的采样与签验、固定发钥及恢复。Yu当前实现的消息容量仅1至4字节，无法容纳公共构造实际签名输入，预检应拒绝该组合。Xie-NTRU路线已有修订研究核，但还不是共同IBSBackend。本文不把组件、数学探针或取得的通用NTRU工具计算为完整IBS。[8–10,E08]</w:t>
+        <w:t>Foo–Li、Yu2026与Sageloli-SIS、Sageloli-RSIS已有完整单体研究后端。其中Sageloli实现覆盖H1/H2、盐、矩阵或环上的采样与签验、固定发钥及恢复；其环版v3执行域已按论文两组大参数完成Setup、全列发钥、签验与恢复的独立实跑，未接入默认入口。[E14]Yu当前实现的消息容量仅1至4字节，无法容纳公共构造实际签名输入，预检应拒绝该组合。Xie-NTRU路线已有修订研究核，但还不是共同IBSBackend。本文不把组件、数学探针或取得的通用NTRU工具计算为完整IBS。[8–10,E08]</w:t>
       </w:r>
     </w:p>
     <w:p>
@@ -2156,6 +2156,541 @@
           <w:b w:val="0"/>
         </w:rPr>
         <w:t>这些研究说明参数选择与表示成本会直接影响完整组合。它们可以支持后续方案选择，却不能把目标规模候选写成已经实现、运行或已被淘汰的最终方案。</w:t>
+      </w:r>
+    </w:p>
+    <w:p>
+      <w:pPr>
+        <w:pStyle w:val="Heading2"/>
+      </w:pPr>
+      <w:r>
+        <w:t>3.5 原生IBS参数研究与目标规模（Foo–Li）</w:t>
+      </w:r>
+    </w:p>
+    <w:p>
+      <w:r>
+        <w:rPr>
+          <w:b w:val="0"/>
+        </w:rPr>
+        <w:t>Foo–Li后端已具备五方法、固定发钥与恢复的完整单体实现，但其论文只给出渐近参数：经逐页核对，ACISP会议版与作者机构开放版均无任何数值实例，也没有ePrint扩展版，与Sageloli论文直接发表两组128比特数值点的做法不同。[8,E13] 因此该路线的具体参数只能由实现方从论文充分条件推导。当前可运行的q=3、n=1教学配置存在公开伪造，不能作为参数代表。</w:t>
+      </w:r>
+    </w:p>
+    <w:p>
+      <w:r>
+        <w:rPr>
+          <w:b w:val="0"/>
+        </w:rPr>
+        <w:t>本作品对该路线做了两层参数工作。第一层是有限网格预筛：在后端参数门的选定网格内（素数位长3至32每档最大素数、n至4、生成宽度16至2^28九档）检查正则性与质量链联动，621个探针未找到可交精确筛查的候选窗口；预筛使用浮点镜像并带四比特余量，空窗口不是严格排除证书，也不覆盖网格外的合法形状，因此只表述为该网格内未发现，而非全部门内参数的否定。第二层是目标推导：在门外的q至2^127−1、n至4096范围内做带失败归因的搜索，240个候选中130个违反归约范数小于q的必要条件、64个被标准LLL界排除、44个经典硬度估计不足，其余2个通过全部解析充分条件且经典core-SVP估计不低于128比特。该方案质量链使归约范数快速增长，硬度交叉因此推迟到n≈4096，如表3所示。</w:t>
+      </w:r>
+    </w:p>
+    <w:p>
+      <w:pPr>
+        <w:pStyle w:val="Caption"/>
+        <w:keepNext/>
+        <w:jc w:val="center"/>
+      </w:pPr>
+      <w:r>
+        <w:t>表3 Foo–Li候选目标参数的core-SVP硬度交叉（q=2^127−1，Chen–Nguyen启发式）</w:t>
+      </w:r>
+    </w:p>
+    <w:tbl>
+      <w:tblPr>
+        <w:tblW w:type="auto" w:w="0"/>
+        <w:jc w:val="center"/>
+        <w:tblLayout w:type="fixed"/>
+        <w:tblLook w:firstColumn="1" w:firstRow="1" w:lastColumn="0" w:lastRow="0" w:noHBand="0" w:noVBand="1" w:val="04A0"/>
+        <w:tblBorders>
+          <w:top w:val="single" w:sz="4" w:color="D9D9D9"/>
+          <w:left w:val="single" w:sz="4" w:color="D9D9D9"/>
+          <w:bottom w:val="single" w:sz="4" w:color="D9D9D9"/>
+          <w:right w:val="single" w:sz="4" w:color="D9D9D9"/>
+          <w:insideH w:val="single" w:sz="4" w:color="D9D9D9"/>
+          <w:insideV w:val="single" w:sz="4" w:color="D9D9D9"/>
+        </w:tblBorders>
+      </w:tblPr>
+      <w:tblGrid>
+        <w:gridCol w:w="3061"/>
+        <w:gridCol w:w="1984"/>
+        <w:gridCol w:w="1984"/>
+        <w:gridCol w:w="2041"/>
+      </w:tblGrid>
+      <w:tr>
+        <w:trPr>
+          <w:cantSplit/>
+          <w:tblHeader/>
+        </w:trPr>
+        <w:tc>
+          <w:tcPr>
+            <w:tcW w:type="dxa" w:w="3061"/>
+            <w:vAlign w:val="center"/>
+            <w:tcMar>
+              <w:top w:w="60" w:type="dxa"/>
+              <w:bottom w:w="60" w:type="dxa"/>
+              <w:left w:w="95" w:type="dxa"/>
+              <w:right w:w="95" w:type="dxa"/>
+            </w:tcMar>
+            <w:shd w:fill="E9EDF0"/>
+          </w:tcPr>
+          <w:p>
+            <w:pPr>
+              <w:keepNext/>
+              <w:spacing w:line="283" w:lineRule="auto" w:after="0"/>
+              <w:ind w:firstLine="0"/>
+              <w:jc w:val="center"/>
+            </w:pPr>
+            <w:r>
+              <w:rPr>
+                <w:b/>
+                <w:sz w:val="18"/>
+              </w:rPr>
+              <w:t>n</w:t>
+            </w:r>
+          </w:p>
+        </w:tc>
+        <w:tc>
+          <w:tcPr>
+            <w:tcW w:type="dxa" w:w="1984"/>
+            <w:vAlign w:val="center"/>
+            <w:tcMar>
+              <w:top w:w="60" w:type="dxa"/>
+              <w:bottom w:w="60" w:type="dxa"/>
+              <w:left w:w="95" w:type="dxa"/>
+              <w:right w:w="95" w:type="dxa"/>
+            </w:tcMar>
+            <w:shd w:fill="E9EDF0"/>
+          </w:tcPr>
+          <w:p>
+            <w:pPr>
+              <w:keepNext/>
+              <w:spacing w:line="283" w:lineRule="auto" w:after="0"/>
+              <w:ind w:firstLine="0"/>
+              <w:jc w:val="center"/>
+            </w:pPr>
+            <w:r>
+              <w:rPr>
+                <w:b/>
+                <w:sz w:val="18"/>
+              </w:rPr>
+              <w:t>完整维度d</w:t>
+            </w:r>
+          </w:p>
+        </w:tc>
+        <w:tc>
+          <w:tcPr>
+            <w:tcW w:type="dxa" w:w="1984"/>
+            <w:vAlign w:val="center"/>
+            <w:tcMar>
+              <w:top w:w="60" w:type="dxa"/>
+              <w:bottom w:w="60" w:type="dxa"/>
+              <w:left w:w="95" w:type="dxa"/>
+              <w:right w:w="95" w:type="dxa"/>
+            </w:tcMar>
+            <w:shd w:fill="E9EDF0"/>
+          </w:tcPr>
+          <w:p>
+            <w:pPr>
+              <w:keepNext/>
+              <w:spacing w:line="283" w:lineRule="auto" w:after="0"/>
+              <w:ind w:firstLine="0"/>
+              <w:jc w:val="center"/>
+            </w:pPr>
+            <w:r>
+              <w:rPr>
+                <w:b/>
+                <w:sz w:val="18"/>
+              </w:rPr>
+              <w:t>经典／量子（比特）</w:t>
+            </w:r>
+          </w:p>
+        </w:tc>
+        <w:tc>
+          <w:tcPr>
+            <w:tcW w:type="dxa" w:w="2041"/>
+            <w:vAlign w:val="center"/>
+            <w:tcMar>
+              <w:top w:w="60" w:type="dxa"/>
+              <w:bottom w:w="60" w:type="dxa"/>
+              <w:left w:w="95" w:type="dxa"/>
+              <w:right w:w="95" w:type="dxa"/>
+            </w:tcMar>
+            <w:shd w:fill="E9EDF0"/>
+          </w:tcPr>
+          <w:p>
+            <w:pPr>
+              <w:keepNext/>
+              <w:spacing w:line="283" w:lineRule="auto" w:after="0"/>
+              <w:ind w:firstLine="0"/>
+              <w:jc w:val="center"/>
+            </w:pPr>
+            <w:r>
+              <w:rPr>
+                <w:b/>
+                <w:sz w:val="18"/>
+              </w:rPr>
+              <w:t>判定</w:t>
+            </w:r>
+          </w:p>
+        </w:tc>
+      </w:tr>
+      <w:tr>
+        <w:trPr>
+          <w:cantSplit/>
+        </w:trPr>
+        <w:tc>
+          <w:tcPr>
+            <w:tcW w:type="dxa" w:w="3061"/>
+            <w:vAlign w:val="center"/>
+            <w:tcMar>
+              <w:top w:w="60" w:type="dxa"/>
+              <w:bottom w:w="60" w:type="dxa"/>
+              <w:left w:w="95" w:type="dxa"/>
+              <w:right w:w="95" w:type="dxa"/>
+            </w:tcMar>
+            <w:shd w:fill="FFFFFF"/>
+          </w:tcPr>
+          <w:p>
+            <w:pPr>
+              <w:keepNext/>
+              <w:spacing w:line="283" w:lineRule="auto" w:after="0"/>
+              <w:ind w:firstLine="0"/>
+            </w:pPr>
+            <w:r>
+              <w:rPr>
+                <w:b w:val="0"/>
+                <w:sz w:val="18"/>
+              </w:rPr>
+              <w:t>1024</w:t>
+            </w:r>
+          </w:p>
+        </w:tc>
+        <w:tc>
+          <w:tcPr>
+            <w:tcW w:type="dxa" w:w="1984"/>
+            <w:vAlign w:val="center"/>
+            <w:tcMar>
+              <w:top w:w="60" w:type="dxa"/>
+              <w:bottom w:w="60" w:type="dxa"/>
+              <w:left w:w="95" w:type="dxa"/>
+              <w:right w:w="95" w:type="dxa"/>
+            </w:tcMar>
+            <w:shd w:fill="FFFFFF"/>
+          </w:tcPr>
+          <w:p>
+            <w:pPr>
+              <w:keepNext/>
+              <w:spacing w:line="283" w:lineRule="auto" w:after="0"/>
+              <w:ind w:firstLine="0"/>
+              <w:jc w:val="center"/>
+            </w:pPr>
+            <w:r>
+              <w:rPr>
+                <w:b w:val="0"/>
+                <w:sz w:val="18"/>
+              </w:rPr>
+              <w:t>390,208</w:t>
+            </w:r>
+          </w:p>
+        </w:tc>
+        <w:tc>
+          <w:tcPr>
+            <w:tcW w:type="dxa" w:w="1984"/>
+            <w:vAlign w:val="center"/>
+            <w:tcMar>
+              <w:top w:w="60" w:type="dxa"/>
+              <w:bottom w:w="60" w:type="dxa"/>
+              <w:left w:w="95" w:type="dxa"/>
+              <w:right w:w="95" w:type="dxa"/>
+            </w:tcMar>
+            <w:shd w:fill="FFFFFF"/>
+          </w:tcPr>
+          <w:p>
+            <w:pPr>
+              <w:keepNext/>
+              <w:spacing w:line="283" w:lineRule="auto" w:after="0"/>
+              <w:ind w:firstLine="0"/>
+              <w:jc w:val="center"/>
+            </w:pPr>
+            <w:r>
+              <w:rPr>
+                <w:b w:val="0"/>
+                <w:sz w:val="18"/>
+              </w:rPr>
+              <w:t>15.2／13.8</w:t>
+            </w:r>
+          </w:p>
+        </w:tc>
+        <w:tc>
+          <w:tcPr>
+            <w:tcW w:type="dxa" w:w="2041"/>
+            <w:vAlign w:val="center"/>
+            <w:tcMar>
+              <w:top w:w="60" w:type="dxa"/>
+              <w:bottom w:w="60" w:type="dxa"/>
+              <w:left w:w="95" w:type="dxa"/>
+              <w:right w:w="95" w:type="dxa"/>
+            </w:tcMar>
+            <w:shd w:fill="FFFFFF"/>
+          </w:tcPr>
+          <w:p>
+            <w:pPr>
+              <w:keepNext/>
+              <w:spacing w:line="283" w:lineRule="auto" w:after="0"/>
+              <w:ind w:firstLine="0"/>
+              <w:jc w:val="center"/>
+            </w:pPr>
+            <w:r>
+              <w:rPr>
+                <w:b w:val="0"/>
+                <w:sz w:val="18"/>
+              </w:rPr>
+              <w:t>平凡</w:t>
+            </w:r>
+          </w:p>
+        </w:tc>
+      </w:tr>
+      <w:tr>
+        <w:trPr>
+          <w:cantSplit/>
+        </w:trPr>
+        <w:tc>
+          <w:tcPr>
+            <w:tcW w:type="dxa" w:w="3061"/>
+            <w:vAlign w:val="center"/>
+            <w:tcMar>
+              <w:top w:w="60" w:type="dxa"/>
+              <w:bottom w:w="60" w:type="dxa"/>
+              <w:left w:w="95" w:type="dxa"/>
+              <w:right w:w="95" w:type="dxa"/>
+            </w:tcMar>
+            <w:shd w:fill="FFFFFF"/>
+          </w:tcPr>
+          <w:p>
+            <w:pPr>
+              <w:keepNext/>
+              <w:spacing w:line="283" w:lineRule="auto" w:after="0"/>
+              <w:ind w:firstLine="0"/>
+            </w:pPr>
+            <w:r>
+              <w:rPr>
+                <w:b w:val="0"/>
+                <w:sz w:val="18"/>
+              </w:rPr>
+              <w:t>2048</w:t>
+            </w:r>
+          </w:p>
+        </w:tc>
+        <w:tc>
+          <w:tcPr>
+            <w:tcW w:type="dxa" w:w="1984"/>
+            <w:vAlign w:val="center"/>
+            <w:tcMar>
+              <w:top w:w="60" w:type="dxa"/>
+              <w:bottom w:w="60" w:type="dxa"/>
+              <w:left w:w="95" w:type="dxa"/>
+              <w:right w:w="95" w:type="dxa"/>
+            </w:tcMar>
+            <w:shd w:fill="FFFFFF"/>
+          </w:tcPr>
+          <w:p>
+            <w:pPr>
+              <w:keepNext/>
+              <w:spacing w:line="283" w:lineRule="auto" w:after="0"/>
+              <w:ind w:firstLine="0"/>
+              <w:jc w:val="center"/>
+            </w:pPr>
+            <w:r>
+              <w:rPr>
+                <w:b w:val="0"/>
+                <w:sz w:val="18"/>
+              </w:rPr>
+              <w:t>780,304</w:t>
+            </w:r>
+          </w:p>
+        </w:tc>
+        <w:tc>
+          <w:tcPr>
+            <w:tcW w:type="dxa" w:w="1984"/>
+            <w:vAlign w:val="center"/>
+            <w:tcMar>
+              <w:top w:w="60" w:type="dxa"/>
+              <w:bottom w:w="60" w:type="dxa"/>
+              <w:left w:w="95" w:type="dxa"/>
+              <w:right w:w="95" w:type="dxa"/>
+            </w:tcMar>
+            <w:shd w:fill="FFFFFF"/>
+          </w:tcPr>
+          <w:p>
+            <w:pPr>
+              <w:keepNext/>
+              <w:spacing w:line="283" w:lineRule="auto" w:after="0"/>
+              <w:ind w:firstLine="0"/>
+              <w:jc w:val="center"/>
+            </w:pPr>
+            <w:r>
+              <w:rPr>
+                <w:b w:val="0"/>
+                <w:sz w:val="18"/>
+              </w:rPr>
+              <w:t>51.4／46.6</w:t>
+            </w:r>
+          </w:p>
+        </w:tc>
+        <w:tc>
+          <w:tcPr>
+            <w:tcW w:type="dxa" w:w="2041"/>
+            <w:vAlign w:val="center"/>
+            <w:tcMar>
+              <w:top w:w="60" w:type="dxa"/>
+              <w:bottom w:w="60" w:type="dxa"/>
+              <w:left w:w="95" w:type="dxa"/>
+              <w:right w:w="95" w:type="dxa"/>
+            </w:tcMar>
+            <w:shd w:fill="FFFFFF"/>
+          </w:tcPr>
+          <w:p>
+            <w:pPr>
+              <w:keepNext/>
+              <w:spacing w:line="283" w:lineRule="auto" w:after="0"/>
+              <w:ind w:firstLine="0"/>
+              <w:jc w:val="center"/>
+            </w:pPr>
+            <w:r>
+              <w:rPr>
+                <w:b w:val="0"/>
+                <w:sz w:val="18"/>
+              </w:rPr>
+              <w:t>不足</w:t>
+            </w:r>
+          </w:p>
+        </w:tc>
+      </w:tr>
+      <w:tr>
+        <w:trPr>
+          <w:cantSplit/>
+        </w:trPr>
+        <w:tc>
+          <w:tcPr>
+            <w:tcW w:type="dxa" w:w="3061"/>
+            <w:vAlign w:val="center"/>
+            <w:tcMar>
+              <w:top w:w="60" w:type="dxa"/>
+              <w:bottom w:w="60" w:type="dxa"/>
+              <w:left w:w="95" w:type="dxa"/>
+              <w:right w:w="95" w:type="dxa"/>
+            </w:tcMar>
+            <w:shd w:fill="FFFFFF"/>
+          </w:tcPr>
+          <w:p>
+            <w:pPr>
+              <w:keepNext w:val="0"/>
+              <w:spacing w:line="283" w:lineRule="auto" w:after="0"/>
+              <w:ind w:firstLine="0"/>
+            </w:pPr>
+            <w:r>
+              <w:rPr>
+                <w:b w:val="0"/>
+                <w:sz w:val="18"/>
+              </w:rPr>
+              <w:t>4096</w:t>
+            </w:r>
+          </w:p>
+        </w:tc>
+        <w:tc>
+          <w:tcPr>
+            <w:tcW w:type="dxa" w:w="1984"/>
+            <w:vAlign w:val="center"/>
+            <w:tcMar>
+              <w:top w:w="60" w:type="dxa"/>
+              <w:bottom w:w="60" w:type="dxa"/>
+              <w:left w:w="95" w:type="dxa"/>
+              <w:right w:w="95" w:type="dxa"/>
+            </w:tcMar>
+            <w:shd w:fill="FFFFFF"/>
+          </w:tcPr>
+          <w:p>
+            <w:pPr>
+              <w:keepNext w:val="0"/>
+              <w:spacing w:line="283" w:lineRule="auto" w:after="0"/>
+              <w:ind w:firstLine="0"/>
+              <w:jc w:val="center"/>
+            </w:pPr>
+            <w:r>
+              <w:rPr>
+                <w:b w:val="0"/>
+                <w:sz w:val="18"/>
+              </w:rPr>
+              <w:t>1,560,592</w:t>
+            </w:r>
+          </w:p>
+        </w:tc>
+        <w:tc>
+          <w:tcPr>
+            <w:tcW w:type="dxa" w:w="1984"/>
+            <w:vAlign w:val="center"/>
+            <w:tcMar>
+              <w:top w:w="60" w:type="dxa"/>
+              <w:bottom w:w="60" w:type="dxa"/>
+              <w:left w:w="95" w:type="dxa"/>
+              <w:right w:w="95" w:type="dxa"/>
+            </w:tcMar>
+            <w:shd w:fill="FFFFFF"/>
+          </w:tcPr>
+          <w:p>
+            <w:pPr>
+              <w:keepNext w:val="0"/>
+              <w:spacing w:line="283" w:lineRule="auto" w:after="0"/>
+              <w:ind w:firstLine="0"/>
+              <w:jc w:val="center"/>
+            </w:pPr>
+            <w:r>
+              <w:rPr>
+                <w:b w:val="0"/>
+                <w:sz w:val="18"/>
+              </w:rPr>
+              <w:t>129.9／117.9</w:t>
+            </w:r>
+          </w:p>
+        </w:tc>
+        <w:tc>
+          <w:tcPr>
+            <w:tcW w:type="dxa" w:w="2041"/>
+            <w:vAlign w:val="center"/>
+            <w:tcMar>
+              <w:top w:w="60" w:type="dxa"/>
+              <w:bottom w:w="60" w:type="dxa"/>
+              <w:left w:w="95" w:type="dxa"/>
+              <w:right w:w="95" w:type="dxa"/>
+            </w:tcMar>
+            <w:shd w:fill="FFFFFF"/>
+          </w:tcPr>
+          <w:p>
+            <w:pPr>
+              <w:keepNext w:val="0"/>
+              <w:spacing w:line="283" w:lineRule="auto" w:after="0"/>
+              <w:ind w:firstLine="0"/>
+              <w:jc w:val="center"/>
+            </w:pPr>
+            <w:r>
+              <w:rPr>
+                <w:b w:val="0"/>
+                <w:sz w:val="18"/>
+              </w:rPr>
+              <w:t>经典不低于128，量子未达</w:t>
+            </w:r>
+          </w:p>
+        </w:tc>
+      </w:tr>
+    </w:tbl>
+    <w:p>
+      <w:pPr>
+        <w:spacing w:after="40" w:line="96" w:lineRule="auto"/>
+      </w:pPr>
+    </w:p>
+    <w:p>
+      <w:r>
+        <w:rPr>
+          <w:b w:val="0"/>
+        </w:rPr>
+        <w:t>最小的候选为q=2^127−1、n=4096，公钥约63GiB、主密钥约693GiB、用户私钥约2.9TiB、签名约11.3MiB，按论文充分条件的紧凑打包公式估算；其经典估计129.9比特而量子估计117.9比特未达128，只能按经典口径表述。与已在本机实跑的Sageloli环版论文点（公钥3.3MiB、发钥85秒、峰值1.4GiB）[E14]对照，无结构矩阵路线在同等口径下的对象规模相差四个数量级，这是代数结构带来的路线固有代价。上述候选目标未生成密钥、未运行，`parameters_are_formal=false`；core-SVP为启发式近似，不是安全证明；当前机器也容纳不了其工作集，执行需要专门的分块外存执行域，未列入当前工程范围。该推导不改变任何路线的none/false/false声明。</w:t>
       </w:r>
     </w:p>
     <w:p>
@@ -2426,7 +2961,7 @@
         <w:jc w:val="center"/>
       </w:pPr>
       <w:r>
-        <w:t>表3 完整系统功能证据</w:t>
+        <w:t>表4 完整系统功能证据</w:t>
       </w:r>
     </w:p>
     <w:tbl>
@@ -3184,7 +3719,7 @@
         <w:jc w:val="center"/>
       </w:pPr>
       <w:r>
-        <w:t>表4 三组完整IBME的时间中位数 单位秒</w:t>
+        <w:t>表5 三组完整IBME的时间中位数 单位秒</w:t>
       </w:r>
     </w:p>
     <w:tbl>
@@ -4440,7 +4975,7 @@
         <w:rPr>
           <w:b w:val="0"/>
         </w:rPr>
-        <w:t>图4逐点保留9次热运行观察，并以短横线表示中位数。各点来自3套系统状态内重复调用，不能用于宣称低概率失败界或大规模用户吞吐保证。首次和恢复成本仍以表4为准。</w:t>
+        <w:t>图4逐点保留9次热运行观察，并以短横线表示中位数。各点来自3套系统状态内重复调用，不能用于宣称低概率失败界或大规模用户吞吐保证。首次和恢复成本仍以表5为准。</w:t>
       </w:r>
     </w:p>
     <w:p>
@@ -4458,7 +4993,7 @@
         <w:jc w:val="center"/>
       </w:pPr>
       <w:r>
-        <w:t>表5 完整wire及持久对象尺寸 单位字节</w:t>
+        <w:t>表6 完整wire及持久对象尺寸 单位字节</w:t>
       </w:r>
     </w:p>
     <w:tbl>
@@ -5249,7 +5784,7 @@
         <w:jc w:val="center"/>
       </w:pPr>
       <w:r>
-        <w:t>表6 运行位置消融 时间中位数单位毫秒</w:t>
+        <w:t>表7 运行位置消融 时间中位数单位毫秒</w:t>
       </w:r>
     </w:p>
     <w:tbl>
@@ -5843,7 +6378,7 @@
         <w:jc w:val="center"/>
       </w:pPr>
       <w:r>
-        <w:t>表7 SRGG签名无损编码尺寸中位数 单位字节</w:t>
+        <w:t>表8 SRGG签名无损编码尺寸中位数 单位字节</w:t>
       </w:r>
     </w:p>
     <w:tbl>
@@ -6344,7 +6879,7 @@
         <w:rPr>
           <w:b w:val="0"/>
         </w:rPr>
-        <w:t>编码前后没有修改签名方程、采样、参数或默认服务。文件变小带来传输与落盘收益，但完整API可能因编码增加耗时。该实验尚无真实HIBE配对，不能将表7差值直接从完整IBME密文中扣除，亦不能将单体时间与另一台机器上的完整系统时间排序。</w:t>
+        <w:t>编码前后没有修改签名方程、采样、参数或默认服务。文件变小带来传输与落盘收益，但完整API可能因编码增加耗时。该实验尚无真实HIBE配对，不能将表8差值直接从完整IBME密文中扣除，亦不能将单体时间与另一台机器上的完整系统时间排序。</w:t>
       </w:r>
     </w:p>
     <w:p>
@@ -6584,7 +7119,7 @@
         <w:jc w:val="center"/>
       </w:pPr>
       <w:r>
-        <w:t>表8 HIBE路线清单</w:t>
+        <w:t>表9 HIBE路线清单</w:t>
       </w:r>
     </w:p>
     <w:tbl>
@@ -7414,7 +7949,7 @@
         <w:jc w:val="center"/>
       </w:pPr>
       <w:r>
-        <w:t>表9 IBS路线清单</w:t>
+        <w:t>表10 IBS路线清单</w:t>
       </w:r>
     </w:p>
     <w:tbl>
@@ -8130,14 +8665,13 @@
               <w:keepNext/>
               <w:spacing w:line="283" w:lineRule="auto" w:after="0"/>
               <w:ind w:firstLine="0"/>
-              <w:jc w:val="center"/>
             </w:pPr>
             <w:r>
               <w:rPr>
                 <w:b w:val="0"/>
                 <w:sz w:val="18"/>
               </w:rPr>
-              <w:t>未默认登记，未真实HIBE配对</w:t>
+              <w:t>未默认登记，未真实HIBE配对；环版v3已按论文两点独立实跑[E14]</w:t>
             </w:r>
           </w:p>
         </w:tc>
@@ -8218,14 +8752,13 @@
               <w:keepNext/>
               <w:spacing w:line="283" w:lineRule="auto" w:after="0"/>
               <w:ind w:firstLine="0"/>
-              <w:jc w:val="center"/>
             </w:pPr>
             <w:r>
               <w:rPr>
                 <w:b w:val="0"/>
                 <w:sz w:val="18"/>
               </w:rPr>
-              <w:t>未默认登记，未真实HIBE配对</w:t>
+              <w:t>未默认登记，未真实HIBE配对；论文无数值参数，候选目标推导见3.5节与E13</w:t>
             </w:r>
           </w:p>
         </w:tc>
@@ -8522,7 +9055,7 @@
         <w:rPr>
           <w:b w:val="0"/>
         </w:rPr>
-        <w:t>本稿图4、表4、表5从E04比较JSON和参数卡生成，图5与表6从E11消融JSON生成。生成时同时记录输入文件SHA及完整Suite于 report-facts.json。正文使用归档实测值，文档生成不会调用任何密码采样或打开运行私钥。</w:t>
+        <w:t>本稿图4、表5、表6从E04比较JSON和参数卡生成，图5与表7从E11消融JSON生成，表3从E13逐点结果整理。生成时同时记录输入文件SHA及完整Suite于 report-facts.json。正文使用归档实测值，文档生成不会调用任何密码采样或打开运行私钥。</w:t>
       </w:r>
     </w:p>
     <w:p>
@@ -8532,7 +9065,7 @@
         <w:jc w:val="center"/>
       </w:pPr>
       <w:r>
-        <w:t>表10 公开证据索引</w:t>
+        <w:t>表11 公开证据索引</w:t>
       </w:r>
     </w:p>
     <w:tbl>
@@ -9822,7 +10355,7 @@
           </w:tcPr>
           <w:p>
             <w:pPr>
-              <w:keepNext w:val="0"/>
+              <w:keepNext/>
               <w:spacing w:line="283" w:lineRule="auto" w:after="0"/>
               <w:ind w:firstLine="0"/>
             </w:pPr>
@@ -9849,7 +10382,7 @@
           </w:tcPr>
           <w:p>
             <w:pPr>
-              <w:keepNext w:val="0"/>
+              <w:keepNext/>
               <w:spacing w:line="283" w:lineRule="auto" w:after="0"/>
               <w:ind w:firstLine="0"/>
             </w:pPr>
@@ -9906,6 +10439,224 @@
           </w:tcPr>
           <w:p>
             <w:pPr>
+              <w:keepNext/>
+              <w:spacing w:line="283" w:lineRule="auto" w:after="0"/>
+              <w:ind w:firstLine="0"/>
+              <w:jc w:val="center"/>
+            </w:pPr>
+            <w:r>
+              <w:rPr>
+                <w:b w:val="0"/>
+                <w:sz w:val="18"/>
+              </w:rPr>
+              <w:t>Web与CLI及判定修订</w:t>
+            </w:r>
+          </w:p>
+        </w:tc>
+      </w:tr>
+      <w:tr>
+        <w:trPr>
+          <w:cantSplit/>
+        </w:trPr>
+        <w:tc>
+          <w:tcPr>
+            <w:tcW w:type="dxa" w:w="737"/>
+            <w:vAlign w:val="center"/>
+            <w:tcMar>
+              <w:top w:w="60" w:type="dxa"/>
+              <w:bottom w:w="60" w:type="dxa"/>
+              <w:left w:w="95" w:type="dxa"/>
+              <w:right w:w="95" w:type="dxa"/>
+            </w:tcMar>
+            <w:shd w:fill="FFFFFF"/>
+          </w:tcPr>
+          <w:p>
+            <w:pPr>
+              <w:keepNext/>
+              <w:spacing w:line="283" w:lineRule="auto" w:after="0"/>
+              <w:ind w:firstLine="0"/>
+            </w:pPr>
+            <w:r>
+              <w:rPr>
+                <w:b w:val="0"/>
+                <w:sz w:val="18"/>
+              </w:rPr>
+              <w:t>E13</w:t>
+            </w:r>
+          </w:p>
+        </w:tc>
+        <w:tc>
+          <w:tcPr>
+            <w:tcW w:type="dxa" w:w="4876"/>
+            <w:vAlign w:val="center"/>
+            <w:tcMar>
+              <w:top w:w="60" w:type="dxa"/>
+              <w:bottom w:w="60" w:type="dxa"/>
+              <w:left w:w="95" w:type="dxa"/>
+              <w:right w:w="95" w:type="dxa"/>
+            </w:tcMar>
+            <w:shd w:fill="FFFFFF"/>
+          </w:tcPr>
+          <w:p>
+            <w:pPr>
+              <w:keepNext/>
+              <w:spacing w:line="283" w:lineRule="auto" w:after="0"/>
+              <w:ind w:firstLine="0"/>
+            </w:pPr>
+            <w:r>
+              <w:rPr>
+                <w:b w:val="0"/>
+                <w:sz w:val="18"/>
+              </w:rPr>
+            </w:r>
+            <w:hyperlink r:id="rId33">
+              <w:r>
+                <w:rPr>
+                  <w:color w:val="000000"/>
+                  <w:u w:val="single"/>
+                </w:rPr>
+                <w:t>Foo–Li参数改进搜索</w:t>
+              </w:r>
+            </w:hyperlink>
+            <w:r>
+              <w:rPr>
+                <w:b w:val="0"/>
+                <w:sz w:val="18"/>
+              </w:rPr>
+              <w:t>与</w:t>
+            </w:r>
+            <w:hyperlink r:id="rId34">
+              <w:r>
+                <w:rPr>
+                  <w:color w:val="000000"/>
+                  <w:u w:val="single"/>
+                </w:rPr>
+                <w:t>逐点结果</w:t>
+              </w:r>
+            </w:hyperlink>
+            <w:r>
+              <w:rPr>
+                <w:b w:val="0"/>
+                <w:sz w:val="18"/>
+              </w:rPr>
+            </w:r>
+          </w:p>
+        </w:tc>
+        <w:tc>
+          <w:tcPr>
+            <w:tcW w:type="dxa" w:w="3458"/>
+            <w:vAlign w:val="center"/>
+            <w:tcMar>
+              <w:top w:w="60" w:type="dxa"/>
+              <w:bottom w:w="60" w:type="dxa"/>
+              <w:left w:w="95" w:type="dxa"/>
+              <w:right w:w="95" w:type="dxa"/>
+            </w:tcMar>
+            <w:shd w:fill="FFFFFF"/>
+          </w:tcPr>
+          <w:p>
+            <w:pPr>
+              <w:keepNext/>
+              <w:spacing w:line="283" w:lineRule="auto" w:after="0"/>
+              <w:ind w:firstLine="0"/>
+              <w:jc w:val="center"/>
+            </w:pPr>
+            <w:r>
+              <w:rPr>
+                <w:b w:val="0"/>
+                <w:sz w:val="18"/>
+              </w:rPr>
+              <w:t>门内穷举否定、硬度交叉与候选目标卡</w:t>
+            </w:r>
+          </w:p>
+        </w:tc>
+      </w:tr>
+      <w:tr>
+        <w:trPr>
+          <w:cantSplit/>
+        </w:trPr>
+        <w:tc>
+          <w:tcPr>
+            <w:tcW w:type="dxa" w:w="737"/>
+            <w:vAlign w:val="center"/>
+            <w:tcMar>
+              <w:top w:w="60" w:type="dxa"/>
+              <w:bottom w:w="60" w:type="dxa"/>
+              <w:left w:w="95" w:type="dxa"/>
+              <w:right w:w="95" w:type="dxa"/>
+            </w:tcMar>
+            <w:shd w:fill="FFFFFF"/>
+          </w:tcPr>
+          <w:p>
+            <w:pPr>
+              <w:keepNext w:val="0"/>
+              <w:spacing w:line="283" w:lineRule="auto" w:after="0"/>
+              <w:ind w:firstLine="0"/>
+            </w:pPr>
+            <w:r>
+              <w:rPr>
+                <w:b w:val="0"/>
+                <w:sz w:val="18"/>
+              </w:rPr>
+              <w:t>E14</w:t>
+            </w:r>
+          </w:p>
+        </w:tc>
+        <w:tc>
+          <w:tcPr>
+            <w:tcW w:type="dxa" w:w="4876"/>
+            <w:vAlign w:val="center"/>
+            <w:tcMar>
+              <w:top w:w="60" w:type="dxa"/>
+              <w:bottom w:w="60" w:type="dxa"/>
+              <w:left w:w="95" w:type="dxa"/>
+              <w:right w:w="95" w:type="dxa"/>
+            </w:tcMar>
+            <w:shd w:fill="FFFFFF"/>
+          </w:tcPr>
+          <w:p>
+            <w:pPr>
+              <w:keepNext w:val="0"/>
+              <w:spacing w:line="283" w:lineRule="auto" w:after="0"/>
+              <w:ind w:firstLine="0"/>
+            </w:pPr>
+            <w:r>
+              <w:rPr>
+                <w:b w:val="0"/>
+                <w:sz w:val="18"/>
+              </w:rPr>
+            </w:r>
+            <w:hyperlink r:id="rId35">
+              <w:r>
+                <w:rPr>
+                  <w:color w:val="000000"/>
+                  <w:u w:val="single"/>
+                </w:rPr>
+                <w:t>Sageloli环版论文参数实跑</w:t>
+              </w:r>
+            </w:hyperlink>
+            <w:r>
+              <w:rPr>
+                <w:b w:val="0"/>
+                <w:sz w:val="18"/>
+              </w:rPr>
+            </w:r>
+          </w:p>
+        </w:tc>
+        <w:tc>
+          <w:tcPr>
+            <w:tcW w:type="dxa" w:w="3458"/>
+            <w:vAlign w:val="center"/>
+            <w:tcMar>
+              <w:top w:w="60" w:type="dxa"/>
+              <w:bottom w:w="60" w:type="dxa"/>
+              <w:left w:w="95" w:type="dxa"/>
+              <w:right w:w="95" w:type="dxa"/>
+            </w:tcMar>
+            <w:shd w:fill="FFFFFF"/>
+          </w:tcPr>
+          <w:p>
+            <w:pPr>
               <w:keepNext w:val="0"/>
               <w:spacing w:line="283" w:lineRule="auto" w:after="0"/>
               <w:ind w:firstLine="0"/>
@@ -9916,7 +10667,7 @@
                 <w:b w:val="0"/>
                 <w:sz w:val="18"/>
               </w:rPr>
-              <w:t>Web与CLI及判定修订</w:t>
+              <w:t>论文两点独立实跑与边界</w:t>
             </w:r>
           </w:p>
         </w:tc>
@@ -9939,7 +10690,7 @@
       <w:r>
         <w:t>本稿写作参照仓库</w:t>
       </w:r>
-      <w:hyperlink r:id="rId33">
+      <w:hyperlink r:id="rId36">
         <w:r>
           <w:rPr>
             <w:color w:val="000000"/>
@@ -10150,7 +10901,7 @@
       <w:r>
         <w:t>以上文献的归档版本与文件指纹以</w:t>
       </w:r>
-      <w:hyperlink r:id="rId34">
+      <w:hyperlink r:id="rId37">
         <w:r>
           <w:rPr>
             <w:color w:val="000000"/>

</xml_diff>

<commit_message>
fix(report): bind FooLi table to source rows (WIP layout review)
</commit_message>
<xml_diff>
--- a/docs/reports/2026-10-19-research-draft/研究报告初稿.docx
+++ b/docs/reports/2026-10-19-research-draft/研究报告初稿.docx
@@ -43,10 +43,22 @@
     </w:p>
     <w:p>
       <w:r>
+        <w:t>本稿面向密码技术竞赛作品的技术审阅与后续成稿，原稿以仓库提交 b92967b92a94a4f8e18ae177ea299167b60aac67 为代码说明基点。本次新增Foo–Li表格取自后续main 6f04f2b所含的E13公开参数记录，原三组系统统计继续保留各自来源和环境；附录旧基点快照不发布当前任务排序，当前实现状态见</w:t>
+      </w:r>
+      <w:hyperlink r:id="rId11">
+        <w:r>
+          <w:rPr>
+            <w:color w:val="000000"/>
+            <w:u w:val="single"/>
+          </w:rPr>
+          <w:t>项目进度</w:t>
+        </w:r>
+      </w:hyperlink>
+      <w:r>
         <w:rPr>
           <w:b w:val="0"/>
         </w:rPr>
-        <w:t>本稿面向密码技术竞赛作品的技术审阅与后续成稿，依据仓库提交 b92967b92a94a4f8e18ae177ea299167b60aac67 及其中归档的公开实验材料编写。正文已有完整构造、实现方法和实验分析；最终三组代表组合、本届提交模板与来源许可汇总仍待收口。本文为新建研究稿，不覆盖旧作品报告。</w:t>
+        <w:t>。正文已有完整构造、实现方法和实验分析；最终三组代表组合、本届提交模板与来源许可汇总仍待收口。本文为新建研究稿，不覆盖旧作品报告。</w:t>
       </w:r>
     </w:p>
     <w:p>
@@ -1063,7 +1075,7 @@
                     <pic:cNvPicPr/>
                   </pic:nvPicPr>
                   <pic:blipFill>
-                    <a:blip r:embed="rId11"/>
+                    <a:blip r:embed="rId12"/>
                     <a:stretch>
                       <a:fillRect/>
                     </a:stretch>
@@ -1435,7 +1447,7 @@
                     <pic:cNvPicPr/>
                   </pic:nvPicPr>
                   <pic:blipFill>
-                    <a:blip r:embed="rId12"/>
+                    <a:blip r:embed="rId13"/>
                     <a:stretch>
                       <a:fillRect/>
                     </a:stretch>
@@ -2171,7 +2183,7 @@
         <w:rPr>
           <w:b w:val="0"/>
         </w:rPr>
-        <w:t>Foo–Li后端已具备五方法、固定发钥与恢复的完整单体实现，但其论文只给出渐近参数：经逐页核对，ACISP会议版与作者机构开放版均无任何数值实例，也没有ePrint扩展版，与Sageloli论文直接发表两组128比特数值点的做法不同。[8,E13] 因此该路线的具体参数只能由实现方从论文充分条件推导。当前可运行的q=3、n=1教学配置存在公开伪造，不能作为参数代表。</w:t>
+        <w:t>Foo–Li后端已具备五方法、固定发钥与恢复的完整单体实现，但本稿按E13已核对的ACISP会议版与作者机构开放版记录使用论文的渐近充分条件，未据此宣称已检索所有可能的扩展稿；所核对版本未给出可直接复用的数值实例，与Sageloli论文列出两组数值点的方式不同。[8,E13] 因此该路线的具体参数只能由实现方从论文充分条件推导。当前可运行的q=3、n=1教学配置存在公开伪造，不能作为参数代表。</w:t>
       </w:r>
     </w:p>
     <w:p>
@@ -2179,17 +2191,15 @@
         <w:rPr>
           <w:b w:val="0"/>
         </w:rPr>
-        <w:t>本作品对该路线做了两层参数工作。第一层是有限网格预筛：在后端参数门的选定网格内（素数位长3至32每档最大素数、n至4、生成宽度16至2^28九档）检查正则性与质量链联动，621个探针未找到可交精确筛查的候选窗口；预筛使用浮点镜像并带四比特余量，空窗口不是严格排除证书，也不覆盖网格外的合法形状，因此只表述为该网格内未发现，而非全部门内参数的否定。第二层是目标推导：在门外的q至2^127−1、n至4096范围内做带失败归因的搜索，240个候选中130个违反归约范数小于q的必要条件、64个被标准LLL界排除、44个经典硬度估计不足，其余2个通过全部解析充分条件且经典core-SVP估计不低于128比特。该方案质量链使归约范数快速增长，硬度交叉因此推迟到n≈4096，如表3所示。</w:t>
+        <w:t>本作品对该路线做了两层参数工作。第一层是有限网格预筛：在后端参数门的选定网格内（素数位长3至32每档最大素数、n至4、生成宽度16至2^28九档）检查正则性与质量链联动，621个探针未找到可交精确筛查的候选窗口；预筛使用浮点镜像并带四比特余量，空窗口不是严格排除证书，也不覆盖网格外的合法形状，因此只表述为该网格内未发现，而非全部门内参数的否定。第二层是目标推导：在门外的q至2^127−1、n至4096范围内做带失败归因的搜索，240个候选中130个未通过解析检查、64个被标准LLL界排除、44个经典硬度估计不足，其余2个通过当前解析模型检查且经典core-SVP估计不低于128比特。该方案质量链使归约范数快速增长，本批已测经典128比特估计点位于n=4096，如表3所示。</w:t>
       </w:r>
     </w:p>
     <w:p>
-      <w:pPr>
-        <w:pStyle w:val="Caption"/>
-        <w:keepNext/>
-        <w:jc w:val="center"/>
-      </w:pPr>
       <w:r>
-        <w:t>表3 Foo–Li候选目标参数的core-SVP硬度交叉（q=2^127−1，Chen–Nguyen启发式）</w:t>
+        <w:rPr>
+          <w:b w:val="0"/>
+        </w:rPr>
+        <w:t>表3 Foo–Li选定网格的core-SVP估计（q=2^127−1、g=16，各n取本批最小m̄，Chen–Nguyen启发式）</w:t>
       </w:r>
     </w:p>
     <w:tbl>
@@ -2326,7 +2336,7 @@
                 <w:b/>
                 <w:sz w:val="18"/>
               </w:rPr>
-              <w:t>判定</w:t>
+              <w:t>本模型判断</w:t>
             </w:r>
           </w:p>
         </w:tc>
@@ -2386,7 +2396,7 @@
                 <w:b w:val="0"/>
                 <w:sz w:val="18"/>
               </w:rPr>
-              <w:t>390,208</w:t>
+              <w:t>390,160</w:t>
             </w:r>
           </w:p>
         </w:tc>
@@ -2442,7 +2452,7 @@
                 <w:b w:val="0"/>
                 <w:sz w:val="18"/>
               </w:rPr>
-              <w:t>平凡</w:t>
+              <w:t>搜索下限</w:t>
             </w:r>
           </w:p>
         </w:tc>
@@ -2558,7 +2568,7 @@
                 <w:b w:val="0"/>
                 <w:sz w:val="18"/>
               </w:rPr>
-              <w:t>不足</w:t>
+              <w:t>经典估计不足128</w:t>
             </w:r>
           </w:p>
         </w:tc>
@@ -2674,7 +2684,7 @@
                 <w:b w:val="0"/>
                 <w:sz w:val="18"/>
               </w:rPr>
-              <w:t>经典不低于128，量子未达</w:t>
+              <w:t>仅经典估计不低于128</w:t>
             </w:r>
           </w:p>
         </w:tc>
@@ -2690,7 +2700,23 @@
         <w:rPr>
           <w:b w:val="0"/>
         </w:rPr>
-        <w:t>最小的候选为q=2^127−1、n=4096，公钥约63GiB、主密钥约693GiB、用户私钥约2.9TiB、签名约11.3MiB，按论文充分条件的紧凑打包公式估算；其经典估计129.9比特而量子估计117.9比特未达128，只能按经典口径表述。与已在本机实跑的Sageloli环版论文点（公钥3.3MiB、发钥85秒、峰值1.4GiB）[E14]对照，无结构矩阵路线在同等口径下的对象规模相差四个数量级，这是代数结构带来的路线固有代价。上述候选目标未生成密钥、未运行，`parameters_are_formal=false`；core-SVP为启发式近似，不是安全证明；当前机器也容纳不了其工作集，执行需要专门的分块外存执行域，未列入当前工程范围。该推导不改变任何路线的none/false/false声明。</w:t>
+        <w:t>表3每行完整参数和m̄在report-facts.json中绑定E13逐点记录，维度满足d=m̄+2nk。n=1024的15.2／13.8来自b=53搜索下限；搜索下限不表示已求出实际最便宜攻击，也不能据本批网格证明4096是所有参数域的最小可行维度。</w:t>
+      </w:r>
+    </w:p>
+    <w:p>
+      <w:r>
+        <w:rPr>
+          <w:b w:val="0"/>
+        </w:rPr>
+        <w:t>按E13公钥估计排序的最小候选为q=2^127−1、n=4096、m̄=520208，公钥紧凑比特打包估计约63GiB，经典core-SVP估计129.94、量子117.93比特；本批没有同时达到经典与量子128的候选。该候选未生成目标密钥，且超过现后端执行门。其余主密钥、用户私钥和签名的目标尺寸需在明确表示和计算公式下另行核算，不作为本稿已测数据。</w:t>
+      </w:r>
+    </w:p>
+    <w:p>
+      <w:r>
+        <w:rPr>
+          <w:b w:val="0"/>
+        </w:rPr>
+        <w:t>作为资源示例，E14的Sageloli环版PARAM-I公钥序列化实测约3.35MiB、发钥约85秒、新建进程峰值约1.36GiB；Foo–Li上述约63GiB则是尚未运行候选的公钥打包估计。两种方案的安全模型、参数和统计口径不同，不能把这两个点写成同安全级性能排名或整条路线的固有代价，也不以本机内存判断算法不可行。core-SVP是启发式估计；本批数据与原始实现的none/false/false声明保持不变。</w:t>
       </w:r>
     </w:p>
     <w:p>
@@ -2740,7 +2766,7 @@
                     <pic:cNvPicPr/>
                   </pic:nvPicPr>
                   <pic:blipFill>
-                    <a:blip r:embed="rId13"/>
+                    <a:blip r:embed="rId14"/>
                     <a:stretch>
                       <a:fillRect/>
                     </a:stretch>
@@ -4941,7 +4967,7 @@
                     <pic:cNvPicPr/>
                   </pic:nvPicPr>
                   <pic:blipFill>
-                    <a:blip r:embed="rId14"/>
+                    <a:blip r:embed="rId15"/>
                     <a:stretch>
                       <a:fillRect/>
                     </a:stretch>
@@ -6302,7 +6328,7 @@
                     <pic:cNvPicPr/>
                   </pic:nvPicPr>
                   <pic:blipFill>
-                    <a:blip r:embed="rId15"/>
+                    <a:blip r:embed="rId16"/>
                     <a:stretch>
                       <a:fillRect/>
                     </a:stretch>
@@ -6953,7 +6979,7 @@
                     <pic:cNvPicPr/>
                   </pic:nvPicPr>
                   <pic:blipFill>
-                    <a:blip r:embed="rId16"/>
+                    <a:blip r:embed="rId17"/>
                     <a:stretch>
                       <a:fillRect/>
                     </a:stretch>
@@ -9055,7 +9081,7 @@
         <w:rPr>
           <w:b w:val="0"/>
         </w:rPr>
-        <w:t>本稿图4、表5、表6从E04比较JSON和参数卡生成，图5与表7从E11消融JSON生成，表3从E13逐点结果整理。生成时同时记录输入文件SHA及完整Suite于 report-facts.json。正文使用归档实测值，文档生成不会调用任何密码采样或打开运行私钥。</w:t>
+        <w:t>本稿图4、表5、表6从E04比较JSON和参数卡生成，图5与表7从E11消融JSON生成，表3按明确的q、g和最小m̄选择从E13逐点结果生成。生成时同时记录输入文件SHA及完整Suite于 report-facts.json。正文使用归档实测值，文档生成不会调用任何密码采样或打开运行私钥。</w:t>
       </w:r>
     </w:p>
     <w:p>
@@ -9233,7 +9259,7 @@
                 <w:sz w:val="18"/>
               </w:rPr>
             </w:r>
-            <w:hyperlink r:id="rId17">
+            <w:hyperlink r:id="rId18">
               <w:r>
                 <w:rPr>
                   <w:color w:val="000000"/>
@@ -9334,7 +9360,7 @@
                 <w:sz w:val="18"/>
               </w:rPr>
             </w:r>
-            <w:hyperlink r:id="rId18">
+            <w:hyperlink r:id="rId19">
               <w:r>
                 <w:rPr>
                   <w:color w:val="000000"/>
@@ -9435,7 +9461,7 @@
                 <w:sz w:val="18"/>
               </w:rPr>
             </w:r>
-            <w:hyperlink r:id="rId19">
+            <w:hyperlink r:id="rId20">
               <w:r>
                 <w:rPr>
                   <w:color w:val="000000"/>
@@ -9536,7 +9562,7 @@
                 <w:sz w:val="18"/>
               </w:rPr>
             </w:r>
-            <w:hyperlink r:id="rId20">
+            <w:hyperlink r:id="rId21">
               <w:r>
                 <w:rPr>
                   <w:color w:val="000000"/>
@@ -9552,7 +9578,7 @@
               </w:rPr>
               <w:t>与</w:t>
             </w:r>
-            <w:hyperlink r:id="rId21">
+            <w:hyperlink r:id="rId22">
               <w:r>
                 <w:rPr>
                   <w:color w:val="000000"/>
@@ -9653,7 +9679,7 @@
                 <w:sz w:val="18"/>
               </w:rPr>
             </w:r>
-            <w:hyperlink r:id="rId22">
+            <w:hyperlink r:id="rId23">
               <w:r>
                 <w:rPr>
                   <w:color w:val="000000"/>
@@ -9754,7 +9780,7 @@
                 <w:sz w:val="18"/>
               </w:rPr>
             </w:r>
-            <w:hyperlink r:id="rId23">
+            <w:hyperlink r:id="rId24">
               <w:r>
                 <w:rPr>
                   <w:color w:val="000000"/>
@@ -9770,7 +9796,7 @@
               </w:rPr>
               <w:t>与</w:t>
             </w:r>
-            <w:hyperlink r:id="rId24">
+            <w:hyperlink r:id="rId25">
               <w:r>
                 <w:rPr>
                   <w:color w:val="000000"/>
@@ -9871,7 +9897,7 @@
                 <w:sz w:val="18"/>
               </w:rPr>
             </w:r>
-            <w:hyperlink r:id="rId25">
+            <w:hyperlink r:id="rId26">
               <w:r>
                 <w:rPr>
                   <w:color w:val="000000"/>
@@ -9972,7 +9998,7 @@
                 <w:sz w:val="18"/>
               </w:rPr>
             </w:r>
-            <w:hyperlink r:id="rId26">
+            <w:hyperlink r:id="rId27">
               <w:r>
                 <w:rPr>
                   <w:color w:val="000000"/>
@@ -10073,7 +10099,7 @@
                 <w:sz w:val="18"/>
               </w:rPr>
             </w:r>
-            <w:hyperlink r:id="rId27">
+            <w:hyperlink r:id="rId28">
               <w:r>
                 <w:rPr>
                   <w:color w:val="000000"/>
@@ -10089,7 +10115,7 @@
               </w:rPr>
               <w:t>与</w:t>
             </w:r>
-            <w:hyperlink r:id="rId28">
+            <w:hyperlink r:id="rId29">
               <w:r>
                 <w:rPr>
                   <w:color w:val="000000"/>
@@ -10190,7 +10216,7 @@
                 <w:sz w:val="18"/>
               </w:rPr>
             </w:r>
-            <w:hyperlink r:id="rId29">
+            <w:hyperlink r:id="rId30">
               <w:r>
                 <w:rPr>
                   <w:color w:val="000000"/>
@@ -10291,7 +10317,7 @@
                 <w:sz w:val="18"/>
               </w:rPr>
             </w:r>
-            <w:hyperlink r:id="rId30">
+            <w:hyperlink r:id="rId31">
               <w:r>
                 <w:rPr>
                   <w:color w:val="000000"/>
@@ -10392,7 +10418,7 @@
                 <w:sz w:val="18"/>
               </w:rPr>
             </w:r>
-            <w:hyperlink r:id="rId31">
+            <w:hyperlink r:id="rId32">
               <w:r>
                 <w:rPr>
                   <w:color w:val="000000"/>
@@ -10408,7 +10434,7 @@
               </w:rPr>
               <w:t>与</w:t>
             </w:r>
-            <w:hyperlink r:id="rId32">
+            <w:hyperlink r:id="rId33">
               <w:r>
                 <w:rPr>
                   <w:color w:val="000000"/>
@@ -10509,7 +10535,7 @@
                 <w:sz w:val="18"/>
               </w:rPr>
             </w:r>
-            <w:hyperlink r:id="rId33">
+            <w:hyperlink r:id="rId34">
               <w:r>
                 <w:rPr>
                   <w:color w:val="000000"/>
@@ -10525,7 +10551,7 @@
               </w:rPr>
               <w:t>与</w:t>
             </w:r>
-            <w:hyperlink r:id="rId34">
+            <w:hyperlink r:id="rId35">
               <w:r>
                 <w:rPr>
                   <w:color w:val="000000"/>
@@ -10566,7 +10592,7 @@
                 <w:b w:val="0"/>
                 <w:sz w:val="18"/>
               </w:rPr>
-              <w:t>门内穷举否定、硬度交叉与候选目标卡</w:t>
+              <w:t>有限网格预筛、模型估计与候选目标卡</w:t>
             </w:r>
           </w:p>
         </w:tc>
@@ -10626,7 +10652,7 @@
                 <w:sz w:val="18"/>
               </w:rPr>
             </w:r>
-            <w:hyperlink r:id="rId35">
+            <w:hyperlink r:id="rId36">
               <w:r>
                 <w:rPr>
                   <w:color w:val="000000"/>
@@ -10690,7 +10716,7 @@
       <w:r>
         <w:t>本稿写作参照仓库</w:t>
       </w:r>
-      <w:hyperlink r:id="rId36">
+      <w:hyperlink r:id="rId37">
         <w:r>
           <w:rPr>
             <w:color w:val="000000"/>
@@ -10901,7 +10927,7 @@
       <w:r>
         <w:t>以上文献的归档版本与文件指纹以</w:t>
       </w:r>
-      <w:hyperlink r:id="rId37">
+      <w:hyperlink r:id="rId38">
         <w:r>
           <w:rPr>
             <w:color w:val="000000"/>

</xml_diff>